<commit_message>
docs: cap nhat toan bo so do erd use case sequence va tai lieu bao cao do an
</commit_message>
<xml_diff>
--- a/docs/Bao_Cao_Do_An_Lien_Nganh_PKA_Home.docx
+++ b/docs/Bao_Cao_Do_An_Lien_Nganh_PKA_Home.docx
@@ -8151,7 +8151,7 @@
       <w:r>
         <w:drawing>
           <wp:inline xmlns:a="http://schemas.openxmlformats.org/drawingml/2006/main" xmlns:pic="http://schemas.openxmlformats.org/drawingml/2006/picture">
-            <wp:extent cx="5303520" cy="3263705"/>
+            <wp:extent cx="5303520" cy="3320896"/>
             <wp:docPr id="3" name="Picture 3"/>
             <wp:cNvGraphicFramePr>
               <a:graphicFrameLocks noChangeAspect="1"/>
@@ -8172,7 +8172,7 @@
                   <pic:spPr>
                     <a:xfrm>
                       <a:off x="0" y="0"/>
-                      <a:ext cx="5303520" cy="3263705"/>
+                      <a:ext cx="5303520" cy="3320896"/>
                     </a:xfrm>
                     <a:prstGeom prst="rect"/>
                   </pic:spPr>
@@ -8207,7 +8207,7 @@
       <w:r>
         <w:drawing>
           <wp:inline xmlns:a="http://schemas.openxmlformats.org/drawingml/2006/main" xmlns:pic="http://schemas.openxmlformats.org/drawingml/2006/picture">
-            <wp:extent cx="5303520" cy="3600555"/>
+            <wp:extent cx="5303520" cy="3679018"/>
             <wp:docPr id="4" name="Picture 4"/>
             <wp:cNvGraphicFramePr>
               <a:graphicFrameLocks noChangeAspect="1"/>
@@ -8228,7 +8228,7 @@
                   <pic:spPr>
                     <a:xfrm>
                       <a:off x="0" y="0"/>
-                      <a:ext cx="5303520" cy="3600555"/>
+                      <a:ext cx="5303520" cy="3679018"/>
                     </a:xfrm>
                     <a:prstGeom prst="rect"/>
                   </pic:spPr>
@@ -10345,7 +10345,7 @@
                 <w:color w:val="2D3748"/>
                 <w:sz w:val="20"/>
               </w:rPr>
-              <w:t>update_own_profile</w:t>
+              <w:t>cancel_amenity_booking</w:t>
             </w:r>
           </w:p>
         </w:tc>
@@ -10376,7 +10376,7 @@
                 <w:color w:val="2D3748"/>
                 <w:sz w:val="20"/>
               </w:rPr>
-              <w:t>p_full_name, p_phone</w:t>
+              <w:t>p_booking_id</w:t>
             </w:r>
           </w:p>
         </w:tc>
@@ -10407,7 +10407,7 @@
                 <w:color w:val="2D3748"/>
                 <w:sz w:val="20"/>
               </w:rPr>
-              <w:t>void</w:t>
+              <w:t>json (kết quả hủy)</w:t>
             </w:r>
           </w:p>
         </w:tc>
@@ -10415,6 +10415,132 @@
           <w:tcPr>
             <w:tcW w:type="dxa" w:w="2592"/>
             <w:shd w:fill="FFFFFF"/>
+            <w:tcBorders>
+              <w:top w:val="single" w:sz="4" w:space="0" w:color="E2E8F0"/>
+              <w:left w:val="single" w:sz="4" w:space="0" w:color="E2E8F0"/>
+              <w:bottom w:val="single" w:sz="4" w:space="0" w:color="E2E8F0"/>
+              <w:right w:val="single" w:sz="4" w:space="0" w:color="E2E8F0"/>
+            </w:tcBorders>
+            <w:tcMar>
+              <w:top w:w="90" w:type="dxa"/>
+              <w:bottom w:w="90" w:type="dxa"/>
+              <w:left w:w="130" w:type="dxa"/>
+              <w:right w:w="130" w:type="dxa"/>
+            </w:tcMar>
+          </w:tcPr>
+          <w:p>
+            <w:pPr>
+              <w:spacing w:line="276" w:lineRule="auto" w:after="40"/>
+            </w:pPr>
+            <w:r>
+              <w:rPr>
+                <w:rFonts w:ascii="Times New Roman" w:hAnsi="Times New Roman"/>
+                <w:color w:val="2D3748"/>
+                <w:sz w:val="20"/>
+              </w:rPr>
+              <w:t>Hủy lịch an toàn cho cư dân/BQL, tự động hủy giao dịch tài chính liên quan và đôn lượt Waitlist.</w:t>
+            </w:r>
+          </w:p>
+        </w:tc>
+      </w:tr>
+      <w:tr>
+        <w:tc>
+          <w:tcPr>
+            <w:tcW w:type="dxa" w:w="2592"/>
+            <w:shd w:fill="F7FAFC"/>
+            <w:tcBorders>
+              <w:top w:val="single" w:sz="4" w:space="0" w:color="E2E8F0"/>
+              <w:left w:val="single" w:sz="4" w:space="0" w:color="E2E8F0"/>
+              <w:bottom w:val="single" w:sz="4" w:space="0" w:color="E2E8F0"/>
+              <w:right w:val="single" w:sz="4" w:space="0" w:color="E2E8F0"/>
+            </w:tcBorders>
+            <w:tcMar>
+              <w:top w:w="90" w:type="dxa"/>
+              <w:bottom w:w="90" w:type="dxa"/>
+              <w:left w:w="130" w:type="dxa"/>
+              <w:right w:w="130" w:type="dxa"/>
+            </w:tcMar>
+          </w:tcPr>
+          <w:p>
+            <w:pPr>
+              <w:spacing w:line="276" w:lineRule="auto" w:after="40"/>
+            </w:pPr>
+            <w:r>
+              <w:rPr>
+                <w:rFonts w:ascii="Times New Roman" w:hAnsi="Times New Roman"/>
+                <w:color w:val="2D3748"/>
+                <w:sz w:val="20"/>
+              </w:rPr>
+              <w:t>update_own_profile</w:t>
+            </w:r>
+          </w:p>
+        </w:tc>
+        <w:tc>
+          <w:tcPr>
+            <w:tcW w:type="dxa" w:w="2592"/>
+            <w:shd w:fill="F7FAFC"/>
+            <w:tcBorders>
+              <w:top w:val="single" w:sz="4" w:space="0" w:color="E2E8F0"/>
+              <w:left w:val="single" w:sz="4" w:space="0" w:color="E2E8F0"/>
+              <w:bottom w:val="single" w:sz="4" w:space="0" w:color="E2E8F0"/>
+              <w:right w:val="single" w:sz="4" w:space="0" w:color="E2E8F0"/>
+            </w:tcBorders>
+            <w:tcMar>
+              <w:top w:w="90" w:type="dxa"/>
+              <w:bottom w:w="90" w:type="dxa"/>
+              <w:left w:w="130" w:type="dxa"/>
+              <w:right w:w="130" w:type="dxa"/>
+            </w:tcMar>
+          </w:tcPr>
+          <w:p>
+            <w:pPr>
+              <w:spacing w:line="276" w:lineRule="auto" w:after="40"/>
+            </w:pPr>
+            <w:r>
+              <w:rPr>
+                <w:rFonts w:ascii="Times New Roman" w:hAnsi="Times New Roman"/>
+                <w:color w:val="2D3748"/>
+                <w:sz w:val="20"/>
+              </w:rPr>
+              <w:t>p_full_name, p_phone</w:t>
+            </w:r>
+          </w:p>
+        </w:tc>
+        <w:tc>
+          <w:tcPr>
+            <w:tcW w:type="dxa" w:w="1584"/>
+            <w:shd w:fill="F7FAFC"/>
+            <w:tcBorders>
+              <w:top w:val="single" w:sz="4" w:space="0" w:color="E2E8F0"/>
+              <w:left w:val="single" w:sz="4" w:space="0" w:color="E2E8F0"/>
+              <w:bottom w:val="single" w:sz="4" w:space="0" w:color="E2E8F0"/>
+              <w:right w:val="single" w:sz="4" w:space="0" w:color="E2E8F0"/>
+            </w:tcBorders>
+            <w:tcMar>
+              <w:top w:w="90" w:type="dxa"/>
+              <w:bottom w:w="90" w:type="dxa"/>
+              <w:left w:w="130" w:type="dxa"/>
+              <w:right w:w="130" w:type="dxa"/>
+            </w:tcMar>
+          </w:tcPr>
+          <w:p>
+            <w:pPr>
+              <w:spacing w:line="276" w:lineRule="auto" w:after="40"/>
+            </w:pPr>
+            <w:r>
+              <w:rPr>
+                <w:rFonts w:ascii="Times New Roman" w:hAnsi="Times New Roman"/>
+                <w:color w:val="2D3748"/>
+                <w:sz w:val="20"/>
+              </w:rPr>
+              <w:t>void</w:t>
+            </w:r>
+          </w:p>
+        </w:tc>
+        <w:tc>
+          <w:tcPr>
+            <w:tcW w:type="dxa" w:w="2592"/>
+            <w:shd w:fill="F7FAFC"/>
             <w:tcBorders>
               <w:top w:val="single" w:sz="4" w:space="0" w:color="E2E8F0"/>
               <w:left w:val="single" w:sz="4" w:space="0" w:color="E2E8F0"/>
@@ -10486,7 +10612,7 @@
       <w:r>
         <w:drawing>
           <wp:inline xmlns:a="http://schemas.openxmlformats.org/drawingml/2006/main" xmlns:pic="http://schemas.openxmlformats.org/drawingml/2006/picture">
-            <wp:extent cx="5303520" cy="3276357"/>
+            <wp:extent cx="5303520" cy="3376990"/>
             <wp:docPr id="7" name="Picture 7"/>
             <wp:cNvGraphicFramePr>
               <a:graphicFrameLocks noChangeAspect="1"/>
@@ -10507,7 +10633,7 @@
                   <pic:spPr>
                     <a:xfrm>
                       <a:off x="0" y="0"/>
-                      <a:ext cx="5303520" cy="3276357"/>
+                      <a:ext cx="5303520" cy="3376990"/>
                     </a:xfrm>
                     <a:prstGeom prst="rect"/>
                   </pic:spPr>
@@ -10542,7 +10668,7 @@
       <w:r>
         <w:drawing>
           <wp:inline xmlns:a="http://schemas.openxmlformats.org/drawingml/2006/main" xmlns:pic="http://schemas.openxmlformats.org/drawingml/2006/picture">
-            <wp:extent cx="5303520" cy="3416691"/>
+            <wp:extent cx="5303520" cy="3528151"/>
             <wp:docPr id="8" name="Picture 8"/>
             <wp:cNvGraphicFramePr>
               <a:graphicFrameLocks noChangeAspect="1"/>
@@ -10563,7 +10689,7 @@
                   <pic:spPr>
                     <a:xfrm>
                       <a:off x="0" y="0"/>
-                      <a:ext cx="5303520" cy="3416691"/>
+                      <a:ext cx="5303520" cy="3528151"/>
                     </a:xfrm>
                     <a:prstGeom prst="rect"/>
                   </pic:spPr>
@@ -10598,7 +10724,7 @@
       <w:r>
         <w:drawing>
           <wp:inline xmlns:a="http://schemas.openxmlformats.org/drawingml/2006/main" xmlns:pic="http://schemas.openxmlformats.org/drawingml/2006/picture">
-            <wp:extent cx="5303520" cy="2802750"/>
+            <wp:extent cx="5303520" cy="2998030"/>
             <wp:docPr id="9" name="Picture 9"/>
             <wp:cNvGraphicFramePr>
               <a:graphicFrameLocks noChangeAspect="1"/>
@@ -10619,7 +10745,7 @@
                   <pic:spPr>
                     <a:xfrm>
                       <a:off x="0" y="0"/>
-                      <a:ext cx="5303520" cy="2802750"/>
+                      <a:ext cx="5303520" cy="2998030"/>
                     </a:xfrm>
                     <a:prstGeom prst="rect"/>
                   </pic:spPr>
@@ -10644,6 +10770,62 @@
           <w:sz w:val="21"/>
         </w:rPr>
         <w:t>Hình 2.14a. Sơ đồ trạng thái vòng đời hóa đơn và phiếu phản ánh sự cố</w:t>
+      </w:r>
+    </w:p>
+    <w:p>
+      <w:pPr>
+        <w:spacing w:before="160" w:after="80"/>
+        <w:jc w:val="center"/>
+      </w:pPr>
+      <w:r>
+        <w:drawing>
+          <wp:inline xmlns:a="http://schemas.openxmlformats.org/drawingml/2006/main" xmlns:pic="http://schemas.openxmlformats.org/drawingml/2006/picture">
+            <wp:extent cx="5303520" cy="2532311"/>
+            <wp:docPr id="10" name="Picture 10"/>
+            <wp:cNvGraphicFramePr>
+              <a:graphicFrameLocks noChangeAspect="1"/>
+            </wp:cNvGraphicFramePr>
+            <a:graphic>
+              <a:graphicData uri="http://schemas.openxmlformats.org/drawingml/2006/picture">
+                <pic:pic>
+                  <pic:nvPicPr>
+                    <pic:cNvPr id="0" name="hinh2_15_kien_truc_tien_ich_va_thong_bao.png"/>
+                    <pic:cNvPicPr/>
+                  </pic:nvPicPr>
+                  <pic:blipFill>
+                    <a:blip r:embed="rId19"/>
+                    <a:stretch>
+                      <a:fillRect/>
+                    </a:stretch>
+                  </pic:blipFill>
+                  <pic:spPr>
+                    <a:xfrm>
+                      <a:off x="0" y="0"/>
+                      <a:ext cx="5303520" cy="2532311"/>
+                    </a:xfrm>
+                    <a:prstGeom prst="rect"/>
+                  </pic:spPr>
+                </pic:pic>
+              </a:graphicData>
+            </a:graphic>
+          </wp:inline>
+        </w:drawing>
+      </w:r>
+    </w:p>
+    <w:p>
+      <w:pPr>
+        <w:keepNext w:val="0"/>
+        <w:spacing w:after="240"/>
+        <w:jc w:val="center"/>
+      </w:pPr>
+      <w:r>
+        <w:rPr>
+          <w:rFonts w:ascii="Times New Roman" w:hAnsi="Times New Roman"/>
+          <w:i/>
+          <w:color w:val="4A5568"/>
+          <w:sz w:val="21"/>
+        </w:rPr>
+        <w:t>Hình 2.15. Sơ đồ kiến trúc Quản trị tiện ích 3 Tab và cơ chế thông báo phân nhóm đích</w:t>
       </w:r>
     </w:p>
     <w:p>
@@ -10684,7 +10866,7 @@
         <w:drawing>
           <wp:inline xmlns:a="http://schemas.openxmlformats.org/drawingml/2006/main" xmlns:pic="http://schemas.openxmlformats.org/drawingml/2006/picture">
             <wp:extent cx="5303520" cy="2049132"/>
-            <wp:docPr id="10" name="Picture 10"/>
+            <wp:docPr id="11" name="Picture 11"/>
             <wp:cNvGraphicFramePr>
               <a:graphicFrameLocks noChangeAspect="1"/>
             </wp:cNvGraphicFramePr>
@@ -10696,7 +10878,7 @@
                     <pic:cNvPicPr/>
                   </pic:nvPicPr>
                   <pic:blipFill>
-                    <a:blip r:embed="rId19"/>
+                    <a:blip r:embed="rId20"/>
                     <a:stretch>
                       <a:fillRect/>
                     </a:stretch>
@@ -12259,7 +12441,7 @@
                 <w:color w:val="2D3748"/>
                 <w:sz w:val="20"/>
               </w:rPr>
-              <w:t>Màn hình Ban Quản Lý</w:t>
+              <w:t>Màn hình Ban Quản Lý (3 Tab &amp; A7/A8)</w:t>
             </w:r>
           </w:p>
         </w:tc>
@@ -12321,7 +12503,7 @@
                 <w:color w:val="2D3748"/>
                 <w:sz w:val="20"/>
               </w:rPr>
-              <w:t>52 bài kiểm thử</w:t>
+              <w:t>62 bài kiểm thử</w:t>
             </w:r>
           </w:p>
         </w:tc>
@@ -12416,7 +12598,7 @@
                 <w:color w:val="2D3748"/>
                 <w:sz w:val="20"/>
               </w:rPr>
-              <w:t>Màn hình Cư dân</w:t>
+              <w:t>Màn hình Cư dân (Hủy lịch &amp; Payment)</w:t>
             </w:r>
           </w:p>
         </w:tc>
@@ -12478,7 +12660,7 @@
                 <w:color w:val="2D3748"/>
                 <w:sz w:val="20"/>
               </w:rPr>
-              <w:t>34 bài kiểm thử</w:t>
+              <w:t>37 bài kiểm thử</w:t>
             </w:r>
           </w:p>
         </w:tc>
@@ -12573,7 +12755,7 @@
                 <w:color w:val="2D3748"/>
                 <w:sz w:val="20"/>
               </w:rPr>
-              <w:t>Tổng cộng toàn hệ thống</w:t>
+              <w:t>Kiểm thử tích hợp &amp; Cloud RLS</w:t>
             </w:r>
           </w:p>
         </w:tc>
@@ -12604,7 +12786,7 @@
                 <w:color w:val="2D3748"/>
                 <w:sz w:val="20"/>
               </w:rPr>
-              <w:t>131 tệp kiểm thử</w:t>
+              <w:t>Tích hợp</w:t>
             </w:r>
           </w:p>
         </w:tc>
@@ -12635,7 +12817,7 @@
                 <w:color w:val="2D3748"/>
                 <w:sz w:val="20"/>
               </w:rPr>
-              <w:t>395 bài kiểm thử</w:t>
+              <w:t>3 bài test Cloud RLS</w:t>
             </w:r>
           </w:p>
         </w:tc>
@@ -12666,7 +12848,7 @@
                 <w:color w:val="2D3748"/>
                 <w:sz w:val="20"/>
               </w:rPr>
-              <w:t>Vượt qua toàn bộ</w:t>
+              <w:t>Bỏ qua khi test nội bộ</w:t>
             </w:r>
           </w:p>
         </w:tc>
@@ -12697,7 +12879,164 @@
                 <w:color w:val="2D3748"/>
                 <w:sz w:val="20"/>
               </w:rPr>
-              <w:t>100%</w:t>
+              <w:t>Khảo nghiệm Cloud</w:t>
+            </w:r>
+          </w:p>
+        </w:tc>
+      </w:tr>
+      <w:tr>
+        <w:tc>
+          <w:tcPr>
+            <w:tcW w:type="dxa" w:w="2592"/>
+            <w:shd w:fill="FFFFFF"/>
+            <w:tcBorders>
+              <w:top w:val="single" w:sz="4" w:space="0" w:color="E2E8F0"/>
+              <w:left w:val="single" w:sz="4" w:space="0" w:color="E2E8F0"/>
+              <w:bottom w:val="single" w:sz="4" w:space="0" w:color="E2E8F0"/>
+              <w:right w:val="single" w:sz="4" w:space="0" w:color="E2E8F0"/>
+            </w:tcBorders>
+            <w:tcMar>
+              <w:top w:w="90" w:type="dxa"/>
+              <w:bottom w:w="90" w:type="dxa"/>
+              <w:left w:w="130" w:type="dxa"/>
+              <w:right w:w="130" w:type="dxa"/>
+            </w:tcMar>
+          </w:tcPr>
+          <w:p>
+            <w:pPr>
+              <w:spacing w:line="276" w:lineRule="auto" w:after="40"/>
+            </w:pPr>
+            <w:r>
+              <w:rPr>
+                <w:rFonts w:ascii="Times New Roman" w:hAnsi="Times New Roman"/>
+                <w:color w:val="2D3748"/>
+                <w:sz w:val="20"/>
+              </w:rPr>
+              <w:t>Tổng cộng toàn hệ thống</w:t>
+            </w:r>
+          </w:p>
+        </w:tc>
+        <w:tc>
+          <w:tcPr>
+            <w:tcW w:type="dxa" w:w="1584"/>
+            <w:shd w:fill="FFFFFF"/>
+            <w:tcBorders>
+              <w:top w:val="single" w:sz="4" w:space="0" w:color="E2E8F0"/>
+              <w:left w:val="single" w:sz="4" w:space="0" w:color="E2E8F0"/>
+              <w:bottom w:val="single" w:sz="4" w:space="0" w:color="E2E8F0"/>
+              <w:right w:val="single" w:sz="4" w:space="0" w:color="E2E8F0"/>
+            </w:tcBorders>
+            <w:tcMar>
+              <w:top w:w="90" w:type="dxa"/>
+              <w:bottom w:w="90" w:type="dxa"/>
+              <w:left w:w="130" w:type="dxa"/>
+              <w:right w:w="130" w:type="dxa"/>
+            </w:tcMar>
+          </w:tcPr>
+          <w:p>
+            <w:pPr>
+              <w:spacing w:line="276" w:lineRule="auto" w:after="40"/>
+            </w:pPr>
+            <w:r>
+              <w:rPr>
+                <w:rFonts w:ascii="Times New Roman" w:hAnsi="Times New Roman"/>
+                <w:color w:val="2D3748"/>
+                <w:sz w:val="20"/>
+              </w:rPr>
+              <w:t>131 tệp kiểm thử</w:t>
+            </w:r>
+          </w:p>
+        </w:tc>
+        <w:tc>
+          <w:tcPr>
+            <w:tcW w:type="dxa" w:w="2160"/>
+            <w:shd w:fill="FFFFFF"/>
+            <w:tcBorders>
+              <w:top w:val="single" w:sz="4" w:space="0" w:color="E2E8F0"/>
+              <w:left w:val="single" w:sz="4" w:space="0" w:color="E2E8F0"/>
+              <w:bottom w:val="single" w:sz="4" w:space="0" w:color="E2E8F0"/>
+              <w:right w:val="single" w:sz="4" w:space="0" w:color="E2E8F0"/>
+            </w:tcBorders>
+            <w:tcMar>
+              <w:top w:w="90" w:type="dxa"/>
+              <w:bottom w:w="90" w:type="dxa"/>
+              <w:left w:w="130" w:type="dxa"/>
+              <w:right w:w="130" w:type="dxa"/>
+            </w:tcMar>
+          </w:tcPr>
+          <w:p>
+            <w:pPr>
+              <w:spacing w:line="276" w:lineRule="auto" w:after="40"/>
+            </w:pPr>
+            <w:r>
+              <w:rPr>
+                <w:rFonts w:ascii="Times New Roman" w:hAnsi="Times New Roman"/>
+                <w:color w:val="2D3748"/>
+                <w:sz w:val="20"/>
+              </w:rPr>
+              <w:t>408 bài kiểm thử</w:t>
+            </w:r>
+          </w:p>
+        </w:tc>
+        <w:tc>
+          <w:tcPr>
+            <w:tcW w:type="dxa" w:w="1872"/>
+            <w:shd w:fill="FFFFFF"/>
+            <w:tcBorders>
+              <w:top w:val="single" w:sz="4" w:space="0" w:color="E2E8F0"/>
+              <w:left w:val="single" w:sz="4" w:space="0" w:color="E2E8F0"/>
+              <w:bottom w:val="single" w:sz="4" w:space="0" w:color="E2E8F0"/>
+              <w:right w:val="single" w:sz="4" w:space="0" w:color="E2E8F0"/>
+            </w:tcBorders>
+            <w:tcMar>
+              <w:top w:w="90" w:type="dxa"/>
+              <w:bottom w:w="90" w:type="dxa"/>
+              <w:left w:w="130" w:type="dxa"/>
+              <w:right w:w="130" w:type="dxa"/>
+            </w:tcMar>
+          </w:tcPr>
+          <w:p>
+            <w:pPr>
+              <w:spacing w:line="276" w:lineRule="auto" w:after="40"/>
+            </w:pPr>
+            <w:r>
+              <w:rPr>
+                <w:rFonts w:ascii="Times New Roman" w:hAnsi="Times New Roman"/>
+                <w:color w:val="2D3748"/>
+                <w:sz w:val="20"/>
+              </w:rPr>
+              <w:t>405/405 Logic Đạt 100%</w:t>
+            </w:r>
+          </w:p>
+        </w:tc>
+        <w:tc>
+          <w:tcPr>
+            <w:tcW w:type="dxa" w:w="1152"/>
+            <w:shd w:fill="FFFFFF"/>
+            <w:tcBorders>
+              <w:top w:val="single" w:sz="4" w:space="0" w:color="E2E8F0"/>
+              <w:left w:val="single" w:sz="4" w:space="0" w:color="E2E8F0"/>
+              <w:bottom w:val="single" w:sz="4" w:space="0" w:color="E2E8F0"/>
+              <w:right w:val="single" w:sz="4" w:space="0" w:color="E2E8F0"/>
+            </w:tcBorders>
+            <w:tcMar>
+              <w:top w:w="90" w:type="dxa"/>
+              <w:bottom w:w="90" w:type="dxa"/>
+              <w:left w:w="130" w:type="dxa"/>
+              <w:right w:w="130" w:type="dxa"/>
+            </w:tcMar>
+          </w:tcPr>
+          <w:p>
+            <w:pPr>
+              <w:spacing w:line="276" w:lineRule="auto" w:after="40"/>
+            </w:pPr>
+            <w:r>
+              <w:rPr>
+                <w:rFonts w:ascii="Times New Roman" w:hAnsi="Times New Roman"/>
+                <w:color w:val="2D3748"/>
+                <w:sz w:val="20"/>
+              </w:rPr>
+              <w:t>100% (Logic)</w:t>
             </w:r>
           </w:p>
         </w:tc>
@@ -12716,8 +13055,8 @@
       <w:r>
         <w:drawing>
           <wp:inline xmlns:a="http://schemas.openxmlformats.org/drawingml/2006/main" xmlns:pic="http://schemas.openxmlformats.org/drawingml/2006/picture">
-            <wp:extent cx="5303520" cy="2347420"/>
-            <wp:docPr id="11" name="Picture 11"/>
+            <wp:extent cx="5303520" cy="2278856"/>
+            <wp:docPr id="12" name="Picture 12"/>
             <wp:cNvGraphicFramePr>
               <a:graphicFrameLocks noChangeAspect="1"/>
             </wp:cNvGraphicFramePr>
@@ -12729,7 +13068,7 @@
                     <pic:cNvPicPr/>
                   </pic:nvPicPr>
                   <pic:blipFill>
-                    <a:blip r:embed="rId20"/>
+                    <a:blip r:embed="rId21"/>
                     <a:stretch>
                       <a:fillRect/>
                     </a:stretch>
@@ -12737,7 +13076,7 @@
                   <pic:spPr>
                     <a:xfrm>
                       <a:off x="0" y="0"/>
-                      <a:ext cx="5303520" cy="2347420"/>
+                      <a:ext cx="5303520" cy="2278856"/>
                     </a:xfrm>
                     <a:prstGeom prst="rect"/>
                   </pic:spPr>
@@ -12816,8 +13155,8 @@
       <w:r>
         <w:drawing>
           <wp:inline xmlns:a="http://schemas.openxmlformats.org/drawingml/2006/main" xmlns:pic="http://schemas.openxmlformats.org/drawingml/2006/picture">
-            <wp:extent cx="5303520" cy="2517833"/>
-            <wp:docPr id="12" name="Picture 12"/>
+            <wp:extent cx="5303520" cy="2513217"/>
+            <wp:docPr id="13" name="Picture 13"/>
             <wp:cNvGraphicFramePr>
               <a:graphicFrameLocks noChangeAspect="1"/>
             </wp:cNvGraphicFramePr>
@@ -12829,7 +13168,7 @@
                     <pic:cNvPicPr/>
                   </pic:nvPicPr>
                   <pic:blipFill>
-                    <a:blip r:embed="rId21"/>
+                    <a:blip r:embed="rId22"/>
                     <a:stretch>
                       <a:fillRect/>
                     </a:stretch>
@@ -12837,7 +13176,7 @@
                   <pic:spPr>
                     <a:xfrm>
                       <a:off x="0" y="0"/>
-                      <a:ext cx="5303520" cy="2517833"/>
+                      <a:ext cx="5303520" cy="2513217"/>
                     </a:xfrm>
                     <a:prstGeom prst="rect"/>
                   </pic:spPr>

</xml_diff>